<commit_message>
Add TC26 ,Loginkeywords,Registerpagekeywords,locators.py files
</commit_message>
<xml_diff>
--- a/Documentaion_RobotFramework.docx
+++ b/Documentaion_RobotFramework.docx
@@ -103,6 +103,128 @@
                     <a:xfrm>
                       <a:off x="0" y="0"/>
                       <a:ext cx="5731510" cy="3024505"/>
+                    </a:xfrm>
+                    <a:prstGeom prst="rect">
+                      <a:avLst/>
+                    </a:prstGeom>
+                  </pic:spPr>
+                </pic:pic>
+              </a:graphicData>
+            </a:graphic>
+          </wp:inline>
+        </w:drawing>
+      </w:r>
+    </w:p>
+    <w:p>
+      <w:pPr>
+        <w:rPr>
+          <w:lang w:val="en-US"/>
+        </w:rPr>
+      </w:pPr>
+    </w:p>
+    <w:p>
+      <w:pPr>
+        <w:rPr>
+          <w:lang w:val="en-US"/>
+        </w:rPr>
+      </w:pPr>
+    </w:p>
+    <w:p>
+      <w:pPr>
+        <w:rPr>
+          <w:lang w:val="en-US"/>
+        </w:rPr>
+      </w:pPr>
+    </w:p>
+    <w:p>
+      <w:pPr>
+        <w:rPr>
+          <w:lang w:val="en-US"/>
+        </w:rPr>
+      </w:pPr>
+    </w:p>
+    <w:p>
+      <w:pPr>
+        <w:rPr>
+          <w:lang w:val="en-US"/>
+        </w:rPr>
+      </w:pPr>
+    </w:p>
+    <w:p>
+      <w:pPr>
+        <w:rPr>
+          <w:lang w:val="en-US"/>
+        </w:rPr>
+      </w:pPr>
+    </w:p>
+    <w:p>
+      <w:pPr>
+        <w:rPr>
+          <w:lang w:val="en-US"/>
+        </w:rPr>
+      </w:pPr>
+      <w:r>
+        <w:rPr>
+          <w:lang w:val="en-US"/>
+        </w:rPr>
+        <w:t xml:space="preserve">Page Object </w:t>
+      </w:r>
+      <w:proofErr w:type="spellStart"/>
+      <w:r>
+        <w:rPr>
+          <w:lang w:val="en-US"/>
+        </w:rPr>
+        <w:t>Model:This</w:t>
+      </w:r>
+      <w:proofErr w:type="spellEnd"/>
+      <w:r>
+        <w:rPr>
+          <w:lang w:val="en-US"/>
+        </w:rPr>
+        <w:t xml:space="preserve"> design pattern, we will maintain page element in  separate file</w:t>
+      </w:r>
+    </w:p>
+    <w:p>
+      <w:pPr>
+        <w:rPr>
+          <w:lang w:val="en-US"/>
+        </w:rPr>
+      </w:pPr>
+      <w:r>
+        <w:rPr>
+          <w:lang w:val="en-US"/>
+        </w:rPr>
+        <w:br/>
+      </w:r>
+      <w:r>
+        <w:rPr>
+          <w:noProof/>
+        </w:rPr>
+        <w:drawing>
+          <wp:inline distT="0" distB="0" distL="0" distR="0" wp14:anchorId="4233BAFA" wp14:editId="2D8072B8">
+            <wp:extent cx="5731510" cy="3222625"/>
+            <wp:effectExtent l="0" t="0" r="2540" b="0"/>
+            <wp:docPr id="983155440" name="Picture 1"/>
+            <wp:cNvGraphicFramePr>
+              <a:graphicFrameLocks xmlns:a="http://schemas.openxmlformats.org/drawingml/2006/main" noChangeAspect="1"/>
+            </wp:cNvGraphicFramePr>
+            <a:graphic xmlns:a="http://schemas.openxmlformats.org/drawingml/2006/main">
+              <a:graphicData uri="http://schemas.openxmlformats.org/drawingml/2006/picture">
+                <pic:pic xmlns:pic="http://schemas.openxmlformats.org/drawingml/2006/picture">
+                  <pic:nvPicPr>
+                    <pic:cNvPr id="983155440" name=""/>
+                    <pic:cNvPicPr/>
+                  </pic:nvPicPr>
+                  <pic:blipFill>
+                    <a:blip r:embed="rId6"/>
+                    <a:stretch>
+                      <a:fillRect/>
+                    </a:stretch>
+                  </pic:blipFill>
+                  <pic:spPr>
+                    <a:xfrm>
+                      <a:off x="0" y="0"/>
+                      <a:ext cx="5731510" cy="3222625"/>
                     </a:xfrm>
                     <a:prstGeom prst="rect">
                       <a:avLst/>

</xml_diff>

<commit_message>
Add Testcase1 folder with TC1 and TC26 file, Read.md updated file,Documentaton_RobotFramework file
</commit_message>
<xml_diff>
--- a/Documentaion_RobotFramework.docx
+++ b/Documentaion_RobotFramework.docx
@@ -170,6 +170,7 @@
         <w:t xml:space="preserve">Page Object </w:t>
       </w:r>
       <w:proofErr w:type="spellStart"/>
+      <w:proofErr w:type="gramStart"/>
       <w:r>
         <w:rPr>
           <w:lang w:val="en-US"/>
@@ -177,11 +178,26 @@
         <w:t>Model:This</w:t>
       </w:r>
       <w:proofErr w:type="spellEnd"/>
-      <w:r>
-        <w:rPr>
-          <w:lang w:val="en-US"/>
-        </w:rPr>
-        <w:t xml:space="preserve"> design pattern, we will maintain page element in  separate file</w:t>
+      <w:proofErr w:type="gramEnd"/>
+      <w:r>
+        <w:rPr>
+          <w:lang w:val="en-US"/>
+        </w:rPr>
+        <w:t xml:space="preserve"> design pattern, we will maintain page element </w:t>
+      </w:r>
+      <w:proofErr w:type="gramStart"/>
+      <w:r>
+        <w:rPr>
+          <w:lang w:val="en-US"/>
+        </w:rPr>
+        <w:t>in  separate</w:t>
+      </w:r>
+      <w:proofErr w:type="gramEnd"/>
+      <w:r>
+        <w:rPr>
+          <w:lang w:val="en-US"/>
+        </w:rPr>
+        <w:t xml:space="preserve"> file</w:t>
       </w:r>
     </w:p>
     <w:p>
@@ -225,6 +241,490 @@
                     <a:xfrm>
                       <a:off x="0" y="0"/>
                       <a:ext cx="5731510" cy="3222625"/>
+                    </a:xfrm>
+                    <a:prstGeom prst="rect">
+                      <a:avLst/>
+                    </a:prstGeom>
+                  </pic:spPr>
+                </pic:pic>
+              </a:graphicData>
+            </a:graphic>
+          </wp:inline>
+        </w:drawing>
+      </w:r>
+    </w:p>
+    <w:p>
+      <w:pPr>
+        <w:rPr>
+          <w:lang w:val="en-US"/>
+        </w:rPr>
+      </w:pPr>
+    </w:p>
+    <w:p>
+      <w:pPr>
+        <w:rPr>
+          <w:lang w:val="en-US"/>
+        </w:rPr>
+      </w:pPr>
+    </w:p>
+    <w:p>
+      <w:pPr>
+        <w:pBdr>
+          <w:top w:val="double" w:sz="6" w:space="1" w:color="auto"/>
+          <w:bottom w:val="double" w:sz="6" w:space="1" w:color="auto"/>
+        </w:pBdr>
+        <w:rPr>
+          <w:lang w:val="en-US"/>
+        </w:rPr>
+      </w:pPr>
+    </w:p>
+    <w:p>
+      <w:pPr>
+        <w:rPr>
+          <w:noProof/>
+        </w:rPr>
+      </w:pPr>
+      <w:r>
+        <w:rPr>
+          <w:noProof/>
+        </w:rPr>
+        <w:t>***How to Run tests Parallelly using robotframework-pabot***</w:t>
+      </w:r>
+    </w:p>
+    <w:p>
+      <w:pPr>
+        <w:rPr>
+          <w:noProof/>
+        </w:rPr>
+      </w:pPr>
+      <w:r>
+        <w:rPr>
+          <w:noProof/>
+        </w:rPr>
+        <w:t>First install below package , run command in cmd / Terminal</w:t>
+      </w:r>
+      <w:r>
+        <w:rPr>
+          <w:noProof/>
+        </w:rPr>
+        <w:br/>
+        <w:t>pip install -U robotframework-pabot</w:t>
+      </w:r>
+    </w:p>
+    <w:p>
+      <w:pPr>
+        <w:rPr>
+          <w:noProof/>
+        </w:rPr>
+      </w:pPr>
+      <w:r>
+        <w:rPr>
+          <w:noProof/>
+        </w:rPr>
+        <w:lastRenderedPageBreak/>
+        <w:drawing>
+          <wp:inline distT="0" distB="0" distL="0" distR="0" wp14:anchorId="158306D6" wp14:editId="4B5EDA53">
+            <wp:extent cx="5731510" cy="2613025"/>
+            <wp:effectExtent l="0" t="0" r="2540" b="0"/>
+            <wp:docPr id="124256438" name="Picture 1"/>
+            <wp:cNvGraphicFramePr>
+              <a:graphicFrameLocks xmlns:a="http://schemas.openxmlformats.org/drawingml/2006/main" noChangeAspect="1"/>
+            </wp:cNvGraphicFramePr>
+            <a:graphic xmlns:a="http://schemas.openxmlformats.org/drawingml/2006/main">
+              <a:graphicData uri="http://schemas.openxmlformats.org/drawingml/2006/picture">
+                <pic:pic xmlns:pic="http://schemas.openxmlformats.org/drawingml/2006/picture">
+                  <pic:nvPicPr>
+                    <pic:cNvPr id="124256438" name=""/>
+                    <pic:cNvPicPr/>
+                  </pic:nvPicPr>
+                  <pic:blipFill>
+                    <a:blip r:embed="rId7"/>
+                    <a:stretch>
+                      <a:fillRect/>
+                    </a:stretch>
+                  </pic:blipFill>
+                  <pic:spPr>
+                    <a:xfrm>
+                      <a:off x="0" y="0"/>
+                      <a:ext cx="5731510" cy="2613025"/>
+                    </a:xfrm>
+                    <a:prstGeom prst="rect">
+                      <a:avLst/>
+                    </a:prstGeom>
+                  </pic:spPr>
+                </pic:pic>
+              </a:graphicData>
+            </a:graphic>
+          </wp:inline>
+        </w:drawing>
+      </w:r>
+      <w:r>
+        <w:rPr>
+          <w:noProof/>
+        </w:rPr>
+        <w:br/>
+      </w:r>
+      <w:r>
+        <w:rPr>
+          <w:noProof/>
+        </w:rPr>
+        <w:drawing>
+          <wp:inline distT="0" distB="0" distL="0" distR="0" wp14:anchorId="715B366B" wp14:editId="557F8A6F">
+            <wp:extent cx="5731510" cy="3058160"/>
+            <wp:effectExtent l="0" t="0" r="2540" b="8890"/>
+            <wp:docPr id="1436586562" name="Picture 1"/>
+            <wp:cNvGraphicFramePr>
+              <a:graphicFrameLocks xmlns:a="http://schemas.openxmlformats.org/drawingml/2006/main" noChangeAspect="1"/>
+            </wp:cNvGraphicFramePr>
+            <a:graphic xmlns:a="http://schemas.openxmlformats.org/drawingml/2006/main">
+              <a:graphicData uri="http://schemas.openxmlformats.org/drawingml/2006/picture">
+                <pic:pic xmlns:pic="http://schemas.openxmlformats.org/drawingml/2006/picture">
+                  <pic:nvPicPr>
+                    <pic:cNvPr id="1436586562" name=""/>
+                    <pic:cNvPicPr/>
+                  </pic:nvPicPr>
+                  <pic:blipFill>
+                    <a:blip r:embed="rId8"/>
+                    <a:stretch>
+                      <a:fillRect/>
+                    </a:stretch>
+                  </pic:blipFill>
+                  <pic:spPr>
+                    <a:xfrm>
+                      <a:off x="0" y="0"/>
+                      <a:ext cx="5731510" cy="3058160"/>
+                    </a:xfrm>
+                    <a:prstGeom prst="rect">
+                      <a:avLst/>
+                    </a:prstGeom>
+                  </pic:spPr>
+                </pic:pic>
+              </a:graphicData>
+            </a:graphic>
+          </wp:inline>
+        </w:drawing>
+      </w:r>
+    </w:p>
+    <w:p>
+      <w:pPr>
+        <w:rPr>
+          <w:noProof/>
+        </w:rPr>
+      </w:pPr>
+    </w:p>
+    <w:p>
+      <w:pPr>
+        <w:rPr>
+          <w:noProof/>
+        </w:rPr>
+      </w:pPr>
+    </w:p>
+    <w:p>
+      <w:pPr>
+        <w:rPr>
+          <w:lang w:val="en-US"/>
+        </w:rPr>
+      </w:pPr>
+    </w:p>
+    <w:p>
+      <w:pPr>
+        <w:rPr>
+          <w:lang w:val="en-US"/>
+        </w:rPr>
+      </w:pPr>
+      <w:r>
+        <w:rPr>
+          <w:lang w:val="en-US"/>
+        </w:rPr>
+        <w:lastRenderedPageBreak/>
+        <w:t xml:space="preserve">Plugins for </w:t>
+      </w:r>
+      <w:proofErr w:type="spellStart"/>
+      <w:r>
+        <w:rPr>
+          <w:lang w:val="en-US"/>
+        </w:rPr>
+        <w:t>robotframework-pabot</w:t>
+      </w:r>
+      <w:proofErr w:type="spellEnd"/>
+      <w:r>
+        <w:rPr>
+          <w:lang w:val="en-US"/>
+        </w:rPr>
+        <w:t xml:space="preserve">, install in </w:t>
+      </w:r>
+      <w:proofErr w:type="gramStart"/>
+      <w:r>
+        <w:rPr>
+          <w:lang w:val="en-US"/>
+        </w:rPr>
+        <w:t>project  interpreter</w:t>
+      </w:r>
+      <w:proofErr w:type="gramEnd"/>
+      <w:r>
+        <w:rPr>
+          <w:lang w:val="en-US"/>
+        </w:rPr>
+        <w:br/>
+      </w:r>
+      <w:r>
+        <w:rPr>
+          <w:noProof/>
+        </w:rPr>
+        <w:drawing>
+          <wp:inline distT="0" distB="0" distL="0" distR="0" wp14:anchorId="0B10E8F9" wp14:editId="1174EECA">
+            <wp:extent cx="5731510" cy="3069590"/>
+            <wp:effectExtent l="0" t="0" r="2540" b="0"/>
+            <wp:docPr id="2146154358" name="Picture 1"/>
+            <wp:cNvGraphicFramePr>
+              <a:graphicFrameLocks xmlns:a="http://schemas.openxmlformats.org/drawingml/2006/main" noChangeAspect="1"/>
+            </wp:cNvGraphicFramePr>
+            <a:graphic xmlns:a="http://schemas.openxmlformats.org/drawingml/2006/main">
+              <a:graphicData uri="http://schemas.openxmlformats.org/drawingml/2006/picture">
+                <pic:pic xmlns:pic="http://schemas.openxmlformats.org/drawingml/2006/picture">
+                  <pic:nvPicPr>
+                    <pic:cNvPr id="2146154358" name=""/>
+                    <pic:cNvPicPr/>
+                  </pic:nvPicPr>
+                  <pic:blipFill>
+                    <a:blip r:embed="rId9"/>
+                    <a:stretch>
+                      <a:fillRect/>
+                    </a:stretch>
+                  </pic:blipFill>
+                  <pic:spPr>
+                    <a:xfrm>
+                      <a:off x="0" y="0"/>
+                      <a:ext cx="5731510" cy="3069590"/>
+                    </a:xfrm>
+                    <a:prstGeom prst="rect">
+                      <a:avLst/>
+                    </a:prstGeom>
+                  </pic:spPr>
+                </pic:pic>
+              </a:graphicData>
+            </a:graphic>
+          </wp:inline>
+        </w:drawing>
+      </w:r>
+    </w:p>
+    <w:p>
+      <w:pPr>
+        <w:rPr>
+          <w:lang w:val="en-US"/>
+        </w:rPr>
+      </w:pPr>
+    </w:p>
+    <w:p>
+      <w:r>
+        <w:t xml:space="preserve">***How to Run test cases Parallelly using </w:t>
+      </w:r>
+      <w:proofErr w:type="spellStart"/>
+      <w:r>
+        <w:t>robotframework-pabot</w:t>
+      </w:r>
+      <w:proofErr w:type="spellEnd"/>
+      <w:r>
+        <w:t>***</w:t>
+      </w:r>
+      <w:r>
+        <w:br/>
+        <w:t xml:space="preserve">pip install -U </w:t>
+      </w:r>
+      <w:proofErr w:type="spellStart"/>
+      <w:r>
+        <w:t>robotframework-pabot</w:t>
+      </w:r>
+      <w:proofErr w:type="spellEnd"/>
+      <w:r>
+        <w:br/>
+        <w:t xml:space="preserve">Website </w:t>
+      </w:r>
+      <w:proofErr w:type="spellStart"/>
+      <w:r>
+        <w:t>nam</w:t>
+      </w:r>
+      <w:proofErr w:type="spellEnd"/>
+      <w:r>
+        <w:t>:-https://pypi.org/project/robotframework-pabot/</w:t>
+      </w:r>
+      <w:r>
+        <w:br/>
+        <w:t>Run this command in terminal project directory/Folder</w:t>
+      </w:r>
+      <w:r>
+        <w:br/>
+        <w:t xml:space="preserve"> </w:t>
+      </w:r>
+      <w:proofErr w:type="spellStart"/>
+      <w:r>
+        <w:t>pabot</w:t>
+      </w:r>
+      <w:proofErr w:type="spellEnd"/>
+      <w:r>
+        <w:t xml:space="preserve"> --processes 2 TestCases1\*.robot ---&gt;2 represent how many number of test cases we want to run</w:t>
+      </w:r>
+      <w:r>
+        <w:br/>
+      </w:r>
+      <w:r>
+        <w:br/>
+        <w:t xml:space="preserve">***How to Run test cases using BAT file Parallelly using </w:t>
+      </w:r>
+      <w:proofErr w:type="spellStart"/>
+      <w:r>
+        <w:t>robotframework-pabot</w:t>
+      </w:r>
+      <w:proofErr w:type="spellEnd"/>
+      <w:r>
+        <w:t>***</w:t>
+      </w:r>
+      <w:r>
+        <w:br/>
+      </w:r>
+      <w:proofErr w:type="spellStart"/>
+      <w:r>
+        <w:t>pabot</w:t>
+      </w:r>
+      <w:proofErr w:type="spellEnd"/>
+      <w:r>
+        <w:t xml:space="preserve"> --processes 3 --</w:t>
+      </w:r>
+      <w:proofErr w:type="spellStart"/>
+      <w:r>
+        <w:t>outputdir</w:t>
+      </w:r>
+      <w:proofErr w:type="spellEnd"/>
+      <w:r>
+        <w:t xml:space="preserve"> Results1 TestCases1\*.robot  ---&gt;</w:t>
+      </w:r>
+      <w:proofErr w:type="spellStart"/>
+      <w:r>
+        <w:t>outputdir</w:t>
+      </w:r>
+      <w:proofErr w:type="spellEnd"/>
+      <w:r>
+        <w:t xml:space="preserve"> Results1 will create new folder Results1 in project directory</w:t>
+      </w:r>
+    </w:p>
+    <w:p>
+      <w:pPr>
+        <w:rPr>
+          <w:lang w:val="en-US"/>
+        </w:rPr>
+      </w:pPr>
+    </w:p>
+    <w:p>
+      <w:pPr>
+        <w:rPr>
+          <w:lang w:val="en-US"/>
+        </w:rPr>
+      </w:pPr>
+    </w:p>
+    <w:p>
+      <w:pPr>
+        <w:rPr>
+          <w:lang w:val="en-US"/>
+        </w:rPr>
+      </w:pPr>
+      <w:r>
+        <w:rPr>
+          <w:lang w:val="en-US"/>
+        </w:rPr>
+        <w:t>***Test cases run through batch(.bat) file***</w:t>
+      </w:r>
+    </w:p>
+    <w:p>
+      <w:r>
+        <w:t>create file in project with extension .bat</w:t>
+      </w:r>
+      <w:r>
+        <w:br/>
+        <w:t xml:space="preserve">install all required plugins recommended by </w:t>
+      </w:r>
+      <w:proofErr w:type="gramStart"/>
+      <w:r>
+        <w:t>IDE(</w:t>
+      </w:r>
+      <w:proofErr w:type="spellStart"/>
+      <w:r>
+        <w:t>Pycharm,vs</w:t>
+      </w:r>
+      <w:proofErr w:type="spellEnd"/>
+      <w:proofErr w:type="gramEnd"/>
+      <w:r>
+        <w:t xml:space="preserve"> code etc)</w:t>
+      </w:r>
+      <w:r>
+        <w:br/>
+        <w:t>save below content in .bat file</w:t>
+      </w:r>
+      <w:r>
+        <w:br/>
+        <w:t>cd C:\Users\admin\PycharmProjects\robotframework</w:t>
+      </w:r>
+      <w:r>
+        <w:br/>
+      </w:r>
+      <w:proofErr w:type="spellStart"/>
+      <w:r>
+        <w:t>pabot</w:t>
+      </w:r>
+      <w:proofErr w:type="spellEnd"/>
+      <w:r>
+        <w:t xml:space="preserve"> --processes 3 --</w:t>
+      </w:r>
+      <w:proofErr w:type="spellStart"/>
+      <w:r>
+        <w:t>outputdir</w:t>
+      </w:r>
+      <w:proofErr w:type="spellEnd"/>
+      <w:r>
+        <w:t xml:space="preserve"> Results1 TestCases1\*.robot</w:t>
+      </w:r>
+    </w:p>
+    <w:p>
+      <w:pPr>
+        <w:rPr>
+          <w:lang w:val="en-US"/>
+        </w:rPr>
+      </w:pPr>
+      <w:r>
+        <w:rPr>
+          <w:lang w:val="en-US"/>
+        </w:rPr>
+        <w:lastRenderedPageBreak/>
+        <w:br/>
+      </w:r>
+      <w:r>
+        <w:rPr>
+          <w:noProof/>
+        </w:rPr>
+        <w:drawing>
+          <wp:inline distT="0" distB="0" distL="0" distR="0" wp14:anchorId="4093CBE9" wp14:editId="3747A401">
+            <wp:extent cx="5731510" cy="2821305"/>
+            <wp:effectExtent l="0" t="0" r="2540" b="0"/>
+            <wp:docPr id="490089620" name="Picture 1"/>
+            <wp:cNvGraphicFramePr>
+              <a:graphicFrameLocks xmlns:a="http://schemas.openxmlformats.org/drawingml/2006/main" noChangeAspect="1"/>
+            </wp:cNvGraphicFramePr>
+            <a:graphic xmlns:a="http://schemas.openxmlformats.org/drawingml/2006/main">
+              <a:graphicData uri="http://schemas.openxmlformats.org/drawingml/2006/picture">
+                <pic:pic xmlns:pic="http://schemas.openxmlformats.org/drawingml/2006/picture">
+                  <pic:nvPicPr>
+                    <pic:cNvPr id="490089620" name=""/>
+                    <pic:cNvPicPr/>
+                  </pic:nvPicPr>
+                  <pic:blipFill>
+                    <a:blip r:embed="rId10"/>
+                    <a:stretch>
+                      <a:fillRect/>
+                    </a:stretch>
+                  </pic:blipFill>
+                  <pic:spPr>
+                    <a:xfrm>
+                      <a:off x="0" y="0"/>
+                      <a:ext cx="5731510" cy="2821305"/>
                     </a:xfrm>
                     <a:prstGeom prst="rect">
                       <a:avLst/>
@@ -850,7 +1350,6 @@
   <w:style w:type="character" w:default="1" w:styleId="DefaultParagraphFont">
     <w:name w:val="Default Paragraph Font"/>
     <w:uiPriority w:val="1"/>
-    <w:semiHidden/>
     <w:unhideWhenUsed/>
   </w:style>
   <w:style w:type="table" w:default="1" w:styleId="TableNormal">

</xml_diff>

<commit_message>
ReadExcel_TC, utils file,Excel_keywords.robot file
</commit_message>
<xml_diff>
--- a/Documentaion_RobotFramework.docx
+++ b/Documentaion_RobotFramework.docx
@@ -725,6 +725,85 @@
                     <a:xfrm>
                       <a:off x="0" y="0"/>
                       <a:ext cx="5731510" cy="2821305"/>
+                    </a:xfrm>
+                    <a:prstGeom prst="rect">
+                      <a:avLst/>
+                    </a:prstGeom>
+                  </pic:spPr>
+                </pic:pic>
+              </a:graphicData>
+            </a:graphic>
+          </wp:inline>
+        </w:drawing>
+      </w:r>
+    </w:p>
+    <w:p>
+      <w:pPr>
+        <w:rPr>
+          <w:lang w:val="en-US"/>
+        </w:rPr>
+      </w:pPr>
+    </w:p>
+    <w:p>
+      <w:pPr>
+        <w:rPr>
+          <w:lang w:val="en-US"/>
+        </w:rPr>
+      </w:pPr>
+    </w:p>
+    <w:p>
+      <w:pPr>
+        <w:rPr>
+          <w:lang w:val="en-US"/>
+        </w:rPr>
+      </w:pPr>
+    </w:p>
+    <w:p>
+      <w:pPr>
+        <w:pBdr>
+          <w:top w:val="double" w:sz="6" w:space="1" w:color="auto"/>
+          <w:bottom w:val="double" w:sz="6" w:space="1" w:color="auto"/>
+        </w:pBdr>
+        <w:rPr>
+          <w:lang w:val="en-US"/>
+        </w:rPr>
+      </w:pPr>
+    </w:p>
+    <w:p>
+      <w:pPr>
+        <w:rPr>
+          <w:lang w:val="en-US"/>
+        </w:rPr>
+      </w:pPr>
+      <w:r>
+        <w:rPr>
+          <w:noProof/>
+        </w:rPr>
+        <w:drawing>
+          <wp:inline distT="0" distB="0" distL="0" distR="0" wp14:anchorId="53AA5E3D" wp14:editId="49EE3A1A">
+            <wp:extent cx="5724525" cy="3829050"/>
+            <wp:effectExtent l="0" t="0" r="9525" b="0"/>
+            <wp:docPr id="917522151" name="Picture 1"/>
+            <wp:cNvGraphicFramePr>
+              <a:graphicFrameLocks xmlns:a="http://schemas.openxmlformats.org/drawingml/2006/main" noChangeAspect="1"/>
+            </wp:cNvGraphicFramePr>
+            <a:graphic xmlns:a="http://schemas.openxmlformats.org/drawingml/2006/main">
+              <a:graphicData uri="http://schemas.openxmlformats.org/drawingml/2006/picture">
+                <pic:pic xmlns:pic="http://schemas.openxmlformats.org/drawingml/2006/picture">
+                  <pic:nvPicPr>
+                    <pic:cNvPr id="917522151" name=""/>
+                    <pic:cNvPicPr/>
+                  </pic:nvPicPr>
+                  <pic:blipFill>
+                    <a:blip r:embed="rId11"/>
+                    <a:stretch>
+                      <a:fillRect/>
+                    </a:stretch>
+                  </pic:blipFill>
+                  <pic:spPr>
+                    <a:xfrm>
+                      <a:off x="0" y="0"/>
+                      <a:ext cx="5724525" cy="3829050"/>
                     </a:xfrm>
                     <a:prstGeom prst="rect">
                       <a:avLst/>

</xml_diff>

<commit_message>
Updated readme.md and Documentation_RobotFramework..docx
</commit_message>
<xml_diff>
--- a/Documentaion_RobotFramework.docx
+++ b/Documentaion_RobotFramework.docx
@@ -451,16 +451,8 @@
         <w:rPr>
           <w:lang w:val="en-US"/>
         </w:rPr>
-        <w:t xml:space="preserve">, install in </w:t>
-      </w:r>
-      <w:proofErr w:type="gramStart"/>
-      <w:r>
-        <w:rPr>
-          <w:lang w:val="en-US"/>
-        </w:rPr>
-        <w:t>project  interpreter</w:t>
-      </w:r>
-      <w:proofErr w:type="gramEnd"/>
+        <w:t>, install in project  interpreter</w:t>
+      </w:r>
       <w:r>
         <w:rPr>
           <w:lang w:val="en-US"/>
@@ -640,18 +632,13 @@
       </w:r>
       <w:r>
         <w:br/>
-        <w:t xml:space="preserve">install all required plugins recommended by </w:t>
-      </w:r>
-      <w:proofErr w:type="gramStart"/>
-      <w:r>
-        <w:t>IDE(</w:t>
+        <w:t>install all required plugins recommended by IDE(</w:t>
       </w:r>
       <w:proofErr w:type="spellStart"/>
       <w:r>
         <w:t>Pycharm,vs</w:t>
       </w:r>
       <w:proofErr w:type="spellEnd"/>
-      <w:proofErr w:type="gramEnd"/>
       <w:r>
         <w:t xml:space="preserve"> code etc)</w:t>
       </w:r>
@@ -815,6 +802,148 @@
           </wp:inline>
         </w:drawing>
       </w:r>
+    </w:p>
+    <w:p>
+      <w:pPr>
+        <w:rPr>
+          <w:lang w:val="en-US"/>
+        </w:rPr>
+      </w:pPr>
+    </w:p>
+    <w:p>
+      <w:pPr>
+        <w:rPr>
+          <w:lang w:val="en-US"/>
+        </w:rPr>
+      </w:pPr>
+    </w:p>
+    <w:p>
+      <w:r>
+        <w:t xml:space="preserve">****_How to install Playwright </w:t>
+      </w:r>
+      <w:proofErr w:type="spellStart"/>
+      <w:r>
+        <w:t>codegen</w:t>
+      </w:r>
+      <w:proofErr w:type="spellEnd"/>
+      <w:r>
+        <w:t>, which is used to record script with locators/Elements_****</w:t>
+      </w:r>
+      <w:r>
+        <w:br/>
+      </w:r>
+      <w:r>
+        <w:br/>
+      </w:r>
+      <w:proofErr w:type="spellStart"/>
+      <w:r>
+        <w:t>npm</w:t>
+      </w:r>
+      <w:proofErr w:type="spellEnd"/>
+      <w:r>
+        <w:t xml:space="preserve"> install -D @playwright/test</w:t>
+      </w:r>
+      <w:r>
+        <w:br/>
+      </w:r>
+      <w:r>
+        <w:br/>
+      </w:r>
+      <w:r>
+        <w:br/>
+        <w:t xml:space="preserve">Install Playwright (Node.js project): run </w:t>
+      </w:r>
+      <w:proofErr w:type="spellStart"/>
+      <w:r>
+        <w:t>npm</w:t>
+      </w:r>
+      <w:proofErr w:type="spellEnd"/>
+      <w:r>
+        <w:t xml:space="preserve"> </w:t>
+      </w:r>
+      <w:proofErr w:type="spellStart"/>
+      <w:r>
+        <w:t>init</w:t>
+      </w:r>
+      <w:proofErr w:type="spellEnd"/>
+      <w:r>
+        <w:t xml:space="preserve"> -y &amp;&amp; </w:t>
+      </w:r>
+      <w:proofErr w:type="spellStart"/>
+      <w:r>
+        <w:t>npm</w:t>
+      </w:r>
+      <w:proofErr w:type="spellEnd"/>
+      <w:r>
+        <w:t xml:space="preserve"> install -D @playwright/test.</w:t>
+      </w:r>
+      <w:r>
+        <w:br/>
+      </w:r>
+      <w:r>
+        <w:br/>
+        <w:t xml:space="preserve">Install browsers: run </w:t>
+      </w:r>
+      <w:proofErr w:type="spellStart"/>
+      <w:r>
+        <w:t>npx</w:t>
+      </w:r>
+      <w:proofErr w:type="spellEnd"/>
+      <w:r>
+        <w:t xml:space="preserve"> playwright install.</w:t>
+      </w:r>
+      <w:r>
+        <w:br/>
+      </w:r>
+      <w:r>
+        <w:br/>
+        <w:t xml:space="preserve">Start recorder for a site: run </w:t>
+      </w:r>
+      <w:proofErr w:type="spellStart"/>
+      <w:r>
+        <w:t>npx</w:t>
+      </w:r>
+      <w:proofErr w:type="spellEnd"/>
+      <w:r>
+        <w:t xml:space="preserve"> playwright </w:t>
+      </w:r>
+      <w:proofErr w:type="spellStart"/>
+      <w:r>
+        <w:t>codegen</w:t>
+      </w:r>
+      <w:proofErr w:type="spellEnd"/>
+      <w:r>
+        <w:t xml:space="preserve"> https://demo.guru99.com/test/newtours/</w:t>
+      </w:r>
+      <w:r>
+        <w:br/>
+      </w:r>
+      <w:r>
+        <w:br/>
+        <w:t xml:space="preserve">Interact in the opened browser; </w:t>
+      </w:r>
+      <w:proofErr w:type="spellStart"/>
+      <w:r>
+        <w:t>Codegen</w:t>
+      </w:r>
+      <w:proofErr w:type="spellEnd"/>
+      <w:r>
+        <w:t xml:space="preserve"> will record and show generated code in the Inspector.</w:t>
+      </w:r>
+      <w:r>
+        <w:br/>
+      </w:r>
+      <w:r>
+        <w:br/>
+        <w:t>Stop recording and copy or save the generated script (or use --output &lt;file&gt; to write directly)</w:t>
+      </w:r>
+    </w:p>
+    <w:p>
+      <w:pPr>
+        <w:rPr>
+          <w:lang w:val="en-US"/>
+        </w:rPr>
+      </w:pPr>
     </w:p>
     <w:sectPr>
       <w:pgSz w:w="11906" w:h="16838"/>

</xml_diff>